<commit_message>
docs: agrega capturas de codigo por modulo como evidencia en la seccion 10
Se incorporan 6 capturas (imagenes PNG con resaltado de sintaxis, generadas con Pygments y Pillow) de los modulos RBAC (auth.py), registro de solicitudes (registro.py), motor PDF (motor_pdf.py), vigencia (vigencia.py), workflow y dias habiles (workflow.py/utils.py) y firmas (utils_firma.py). Se insertan en la seccion 10 del documento Plantillas_UMG_Completadas.docx con su pie de figura, ademas del repositorio y la documentacion tecnica. Nuevo generador: generar_capturas_codigo.py.
</commit_message>
<xml_diff>
--- a/proyecto_doc/plantillas_llenadas/Plantillas_UMG_Completadas.docx
+++ b/proyecto_doc/plantillas_llenadas/Plantillas_UMG_Completadas.docx
@@ -3555,7 +3555,7 @@
         <w:drawing>
           <wp:inline xmlns:a="http://schemas.openxmlformats.org/drawingml/2006/main" xmlns:pic="http://schemas.openxmlformats.org/drawingml/2006/picture">
             <wp:extent cx="5669280" cy="4372583"/>
-            <wp:docPr id="1" name="Picture 1"/>
+            <wp:docPr id="7" name="Picture 7"/>
             <wp:cNvGraphicFramePr>
               <a:graphicFrameLocks noChangeAspect="1"/>
             </wp:cNvGraphicFramePr>
@@ -3567,7 +3567,7 @@
                     <pic:cNvPicPr/>
                   </pic:nvPicPr>
                   <pic:blipFill>
-                    <a:blip r:embed="rId11"/>
+                    <a:blip r:embed="rId17"/>
                     <a:stretch>
                       <a:fillRect/>
                     </a:stretch>
@@ -8276,6 +8276,334 @@
         </w:tc>
       </w:tr>
     </w:tbl>
+    <w:p>
+      <w:r>
+        <w:br w:type="page"/>
+      </w:r>
+    </w:p>
+    <w:p>
+      <w:r>
+        <w:rPr>
+          <w:b/>
+          <w:sz w:val="24"/>
+        </w:rPr>
+        <w:t>Evidencias de código fuente por módulos</w:t>
+      </w:r>
+    </w:p>
+    <w:p>
+      <w:r>
+        <w:rPr>
+          <w:sz w:val="19"/>
+        </w:rPr>
+        <w:t>A continuación se presentan fragmentos representativos del código fuente versionado en el repositorio GitHub (https://github.com/ravenc1/setesa_gestion_ausencias). Cada captura indica el archivo de origen dentro de la estructura del proyecto.</w:t>
+      </w:r>
+    </w:p>
+    <w:p>
+      <w:pPr>
+        <w:jc w:val="center"/>
+      </w:pPr>
+      <w:r>
+        <w:drawing>
+          <wp:inline xmlns:a="http://schemas.openxmlformats.org/drawingml/2006/main" xmlns:pic="http://schemas.openxmlformats.org/drawingml/2006/picture">
+            <wp:extent cx="5577840" cy="4509032"/>
+            <wp:docPr id="1" name="Picture 1"/>
+            <wp:cNvGraphicFramePr>
+              <a:graphicFrameLocks noChangeAspect="1"/>
+            </wp:cNvGraphicFramePr>
+            <a:graphic>
+              <a:graphicData uri="http://schemas.openxmlformats.org/drawingml/2006/picture">
+                <pic:pic>
+                  <pic:nvPicPr>
+                    <pic:cNvPr id="0" name="codigo_01_rbac_auth.png"/>
+                    <pic:cNvPicPr/>
+                  </pic:nvPicPr>
+                  <pic:blipFill>
+                    <a:blip r:embed="rId11"/>
+                    <a:stretch>
+                      <a:fillRect/>
+                    </a:stretch>
+                  </pic:blipFill>
+                  <pic:spPr>
+                    <a:xfrm>
+                      <a:off x="0" y="0"/>
+                      <a:ext cx="5577840" cy="4509032"/>
+                    </a:xfrm>
+                    <a:prstGeom prst="rect"/>
+                  </pic:spPr>
+                </pic:pic>
+              </a:graphicData>
+            </a:graphic>
+          </wp:inline>
+        </w:drawing>
+      </w:r>
+    </w:p>
+    <w:p>
+      <w:pPr>
+        <w:jc w:val="center"/>
+      </w:pPr>
+      <w:r>
+        <w:rPr>
+          <w:i/>
+          <w:sz w:val="17"/>
+        </w:rPr>
+        <w:t>Figura 1. Control de Acceso Basado en Roles (RBAC) — src/core/auth.py.</w:t>
+      </w:r>
+    </w:p>
+    <w:p>
+      <w:pPr>
+        <w:jc w:val="center"/>
+      </w:pPr>
+      <w:r>
+        <w:drawing>
+          <wp:inline xmlns:a="http://schemas.openxmlformats.org/drawingml/2006/main" xmlns:pic="http://schemas.openxmlformats.org/drawingml/2006/picture">
+            <wp:extent cx="5577840" cy="3232137"/>
+            <wp:docPr id="2" name="Picture 2"/>
+            <wp:cNvGraphicFramePr>
+              <a:graphicFrameLocks noChangeAspect="1"/>
+            </wp:cNvGraphicFramePr>
+            <a:graphic>
+              <a:graphicData uri="http://schemas.openxmlformats.org/drawingml/2006/picture">
+                <pic:pic>
+                  <pic:nvPicPr>
+                    <pic:cNvPr id="0" name="codigo_02_registro_solicitud.png"/>
+                    <pic:cNvPicPr/>
+                  </pic:nvPicPr>
+                  <pic:blipFill>
+                    <a:blip r:embed="rId12"/>
+                    <a:stretch>
+                      <a:fillRect/>
+                    </a:stretch>
+                  </pic:blipFill>
+                  <pic:spPr>
+                    <a:xfrm>
+                      <a:off x="0" y="0"/>
+                      <a:ext cx="5577840" cy="3232137"/>
+                    </a:xfrm>
+                    <a:prstGeom prst="rect"/>
+                  </pic:spPr>
+                </pic:pic>
+              </a:graphicData>
+            </a:graphic>
+          </wp:inline>
+        </w:drawing>
+      </w:r>
+    </w:p>
+    <w:p>
+      <w:pPr>
+        <w:jc w:val="center"/>
+      </w:pPr>
+      <w:r>
+        <w:rPr>
+          <w:i/>
+          <w:sz w:val="17"/>
+        </w:rPr>
+        <w:t>Figura 2. Registro de solicitudes de ausencia — src/features/registro.py.</w:t>
+      </w:r>
+    </w:p>
+    <w:p>
+      <w:pPr>
+        <w:jc w:val="center"/>
+      </w:pPr>
+      <w:r>
+        <w:drawing>
+          <wp:inline xmlns:a="http://schemas.openxmlformats.org/drawingml/2006/main" xmlns:pic="http://schemas.openxmlformats.org/drawingml/2006/picture">
+            <wp:extent cx="5577840" cy="3508276"/>
+            <wp:docPr id="3" name="Picture 3"/>
+            <wp:cNvGraphicFramePr>
+              <a:graphicFrameLocks noChangeAspect="1"/>
+            </wp:cNvGraphicFramePr>
+            <a:graphic>
+              <a:graphicData uri="http://schemas.openxmlformats.org/drawingml/2006/picture">
+                <pic:pic>
+                  <pic:nvPicPr>
+                    <pic:cNvPr id="0" name="codigo_03_motor_pdf.png"/>
+                    <pic:cNvPicPr/>
+                  </pic:nvPicPr>
+                  <pic:blipFill>
+                    <a:blip r:embed="rId13"/>
+                    <a:stretch>
+                      <a:fillRect/>
+                    </a:stretch>
+                  </pic:blipFill>
+                  <pic:spPr>
+                    <a:xfrm>
+                      <a:off x="0" y="0"/>
+                      <a:ext cx="5577840" cy="3508276"/>
+                    </a:xfrm>
+                    <a:prstGeom prst="rect"/>
+                  </pic:spPr>
+                </pic:pic>
+              </a:graphicData>
+            </a:graphic>
+          </wp:inline>
+        </w:drawing>
+      </w:r>
+    </w:p>
+    <w:p>
+      <w:pPr>
+        <w:jc w:val="center"/>
+      </w:pPr>
+      <w:r>
+        <w:rPr>
+          <w:i/>
+          <w:sz w:val="17"/>
+        </w:rPr>
+        <w:t>Figura 3. Generación automática del PDF (FPDF) — src/services/motor_pdf.py.</w:t>
+      </w:r>
+    </w:p>
+    <w:p>
+      <w:pPr>
+        <w:jc w:val="center"/>
+      </w:pPr>
+      <w:r>
+        <w:drawing>
+          <wp:inline xmlns:a="http://schemas.openxmlformats.org/drawingml/2006/main" xmlns:pic="http://schemas.openxmlformats.org/drawingml/2006/picture">
+            <wp:extent cx="5577840" cy="3944123"/>
+            <wp:docPr id="4" name="Picture 4"/>
+            <wp:cNvGraphicFramePr>
+              <a:graphicFrameLocks noChangeAspect="1"/>
+            </wp:cNvGraphicFramePr>
+            <a:graphic>
+              <a:graphicData uri="http://schemas.openxmlformats.org/drawingml/2006/picture">
+                <pic:pic>
+                  <pic:nvPicPr>
+                    <pic:cNvPr id="0" name="codigo_04_vigencia_baja_logica.png"/>
+                    <pic:cNvPicPr/>
+                  </pic:nvPicPr>
+                  <pic:blipFill>
+                    <a:blip r:embed="rId14"/>
+                    <a:stretch>
+                      <a:fillRect/>
+                    </a:stretch>
+                  </pic:blipFill>
+                  <pic:spPr>
+                    <a:xfrm>
+                      <a:off x="0" y="0"/>
+                      <a:ext cx="5577840" cy="3944123"/>
+                    </a:xfrm>
+                    <a:prstGeom prst="rect"/>
+                  </pic:spPr>
+                </pic:pic>
+              </a:graphicData>
+            </a:graphic>
+          </wp:inline>
+        </w:drawing>
+      </w:r>
+    </w:p>
+    <w:p>
+      <w:pPr>
+        <w:jc w:val="center"/>
+      </w:pPr>
+      <w:r>
+        <w:rPr>
+          <w:i/>
+          <w:sz w:val="17"/>
+        </w:rPr>
+        <w:t>Figura 4. Vigencia de usuarios (baja lógica semestral) — src/features/vigencia.py.</w:t>
+      </w:r>
+    </w:p>
+    <w:p>
+      <w:pPr>
+        <w:jc w:val="center"/>
+      </w:pPr>
+      <w:r>
+        <w:drawing>
+          <wp:inline xmlns:a="http://schemas.openxmlformats.org/drawingml/2006/main" xmlns:pic="http://schemas.openxmlformats.org/drawingml/2006/picture">
+            <wp:extent cx="5577840" cy="3996134"/>
+            <wp:docPr id="5" name="Picture 5"/>
+            <wp:cNvGraphicFramePr>
+              <a:graphicFrameLocks noChangeAspect="1"/>
+            </wp:cNvGraphicFramePr>
+            <a:graphic>
+              <a:graphicData uri="http://schemas.openxmlformats.org/drawingml/2006/picture">
+                <pic:pic>
+                  <pic:nvPicPr>
+                    <pic:cNvPr id="0" name="codigo_05_workflow_dias_habiles.png"/>
+                    <pic:cNvPicPr/>
+                  </pic:nvPicPr>
+                  <pic:blipFill>
+                    <a:blip r:embed="rId15"/>
+                    <a:stretch>
+                      <a:fillRect/>
+                    </a:stretch>
+                  </pic:blipFill>
+                  <pic:spPr>
+                    <a:xfrm>
+                      <a:off x="0" y="0"/>
+                      <a:ext cx="5577840" cy="3996134"/>
+                    </a:xfrm>
+                    <a:prstGeom prst="rect"/>
+                  </pic:spPr>
+                </pic:pic>
+              </a:graphicData>
+            </a:graphic>
+          </wp:inline>
+        </w:drawing>
+      </w:r>
+    </w:p>
+    <w:p>
+      <w:pPr>
+        <w:jc w:val="center"/>
+      </w:pPr>
+      <w:r>
+        <w:rPr>
+          <w:i/>
+          <w:sz w:val="17"/>
+        </w:rPr>
+        <w:t>Figura 5. Estados del workflow y cálculo de días hábiles — src/core/workflow.py  +  src/core/utils.py.</w:t>
+      </w:r>
+    </w:p>
+    <w:p>
+      <w:pPr>
+        <w:jc w:val="center"/>
+      </w:pPr>
+      <w:r>
+        <w:drawing>
+          <wp:inline xmlns:a="http://schemas.openxmlformats.org/drawingml/2006/main" xmlns:pic="http://schemas.openxmlformats.org/drawingml/2006/picture">
+            <wp:extent cx="5577840" cy="3465973"/>
+            <wp:docPr id="6" name="Picture 6"/>
+            <wp:cNvGraphicFramePr>
+              <a:graphicFrameLocks noChangeAspect="1"/>
+            </wp:cNvGraphicFramePr>
+            <a:graphic>
+              <a:graphicData uri="http://schemas.openxmlformats.org/drawingml/2006/picture">
+                <pic:pic>
+                  <pic:nvPicPr>
+                    <pic:cNvPr id="0" name="codigo_06_firmas_base64.png"/>
+                    <pic:cNvPicPr/>
+                  </pic:nvPicPr>
+                  <pic:blipFill>
+                    <a:blip r:embed="rId16"/>
+                    <a:stretch>
+                      <a:fillRect/>
+                    </a:stretch>
+                  </pic:blipFill>
+                  <pic:spPr>
+                    <a:xfrm>
+                      <a:off x="0" y="0"/>
+                      <a:ext cx="5577840" cy="3465973"/>
+                    </a:xfrm>
+                    <a:prstGeom prst="rect"/>
+                  </pic:spPr>
+                </pic:pic>
+              </a:graphicData>
+            </a:graphic>
+          </wp:inline>
+        </w:drawing>
+      </w:r>
+    </w:p>
+    <w:p>
+      <w:pPr>
+        <w:jc w:val="center"/>
+      </w:pPr>
+      <w:r>
+        <w:rPr>
+          <w:i/>
+          <w:sz w:val="17"/>
+        </w:rPr>
+        <w:t>Figura 6. Captura de firmas digitalizadas (Canvas / Base64) — src/services/utils_firma.py.</w:t>
+      </w:r>
+    </w:p>
     <w:p>
       <w:pPr>
         <w:spacing w:after="20"/>

</xml_diff>